<commit_message>
Budget revision: salaries 45,000 SAR/quarter (15,000/month), remove office rent line, rebalance total to 100,000 SAR
- Staff Salaries: 15,000 -> 45,000 SAR (5,000 -> 15,000/month)
- Office Rent line removed entirely
- Marketing, Licenses, Utilities, Tech unchanged (18,000+15,000+12,000+10,000=55,000)
- New total: 45,000+55,000 = 100,000 SAR (unchanged)
- Org chart scaled proportionally: Operations Manager 10,500/mo, Training Coordinator 4,500/mo
- Applied across Word doc, PDF, static plan page, and interactive dashboard (table + pie chart + team table)
</commit_message>
<xml_diff>
--- a/NextTarget_Operational_Plan_Q1_2026.docx
+++ b/NextTarget_Operational_Plan_Q1_2026.docx
@@ -249,7 +249,7 @@
           </w:tcPr>
           <w:p>
             <w:r>
-              <w:t>3,500</w:t>
+              <w:t>10,500</w:t>
             </w:r>
           </w:p>
         </w:tc>
@@ -271,7 +271,7 @@
           </w:tcPr>
           <w:p>
             <w:r>
-              <w:t>1,500</w:t>
+              <w:t>4,500</w:t>
             </w:r>
           </w:p>
         </w:tc>
@@ -299,7 +299,7 @@
               <w:rPr>
                 <w:b/>
               </w:rPr>
-              <w:t>5,000 SAR</w:t>
+              <w:t>15,000 SAR</w:t>
             </w:r>
           </w:p>
         </w:tc>
@@ -437,7 +437,7 @@
           </w:tcPr>
           <w:p>
             <w:r>
-              <w:t>15,000</w:t>
+              <w:t>45,000</w:t>
             </w:r>
           </w:p>
         </w:tc>
@@ -447,7 +447,7 @@
           </w:tcPr>
           <w:p>
             <w:r>
-              <w:t>5,000 شهري × 3 أشهر | 5,000/month × 3</w:t>
+              <w:t>15,000 شهري × 3 أشهر | 15,000/month × 3</w:t>
             </w:r>
           </w:p>
         </w:tc>
@@ -480,38 +480,6 @@
           <w:p>
             <w:r>
               <w:t>6,000 شهري | 6,000/month</w:t>
-            </w:r>
-          </w:p>
-        </w:tc>
-      </w:tr>
-      <w:tr>
-        <w:tc>
-          <w:tcPr>
-            <w:tcW w:type="dxa" w:w="3120"/>
-          </w:tcPr>
-          <w:p>
-            <w:r>
-              <w:t>إيجار المكتب | Office Rent</w:t>
-            </w:r>
-          </w:p>
-        </w:tc>
-        <w:tc>
-          <w:tcPr>
-            <w:tcW w:type="dxa" w:w="3120"/>
-          </w:tcPr>
-          <w:p>
-            <w:r>
-              <w:t>30,000</w:t>
-            </w:r>
-          </w:p>
-        </w:tc>
-        <w:tc>
-          <w:tcPr>
-            <w:tcW w:type="dxa" w:w="3120"/>
-          </w:tcPr>
-          <w:p>
-            <w:r>
-              <w:t>10,000 شهري | 10,000/month</w:t>
             </w:r>
           </w:p>
         </w:tc>
@@ -671,9 +639,9 @@
         <w:br/>
         <w:t>• Total Available: 100,000 SAR</w:t>
         <w:br/>
-        <w:t>• النسبة المئوية للرواتب: 15%</w:t>
+        <w:t>• النسبة المئوية للرواتب: 45%</w:t>
         <w:br/>
-        <w:t>• Salary Percentage: 15%</w:t>
+        <w:t>• Salary Percentage: 45%</w:t>
         <w:br/>
         <w:t>• نسبة التسويق: 18%</w:t>
         <w:br/>

</xml_diff>

<commit_message>
Brand the Word document: add real logo to cover page, apply navy/green/blue brand palette to headings and table headers
- Cover page: inserted the exact company logo (matches dashboard/website asset)
- Title recolored to brand navy (#1A3A52), company name to brand green (#2ECC71)
- Heading1/Heading2 styles recolored to navy/blue to match site identity
- All table header rows: solid navy fill, white bold text (direct cell formatting)
- TOTAL rows: light grey fill, navy bold text
- Fixed LibreOffice RTL corner-cell rendering conflict (firstColumn vs firstRow) by disabling redundant firstColumn table-style flag
- Validated against OOXML schema, visually verified via PDF render of every page
</commit_message>
<xml_diff>
--- a/NextTarget_Operational_Plan_Q1_2026.docx
+++ b/NextTarget_Operational_Plan_Q1_2026.docx
@@ -2,6 +2,49 @@
 <file path=word/document.xml><?xml version="1.0" encoding="utf-8"?>
 <w:document xmlns:wpc="http://schemas.microsoft.com/office/word/2010/wordprocessingCanvas" xmlns:mo="http://schemas.microsoft.com/office/mac/office/2008/main" xmlns:mc="http://schemas.openxmlformats.org/markup-compatibility/2006" xmlns:mv="urn:schemas-microsoft-com:mac:vml" xmlns:o="urn:schemas-microsoft-com:office:office" xmlns:r="http://schemas.openxmlformats.org/officeDocument/2006/relationships" xmlns:m="http://schemas.openxmlformats.org/officeDocument/2006/math" xmlns:v="urn:schemas-microsoft-com:vml" xmlns:wp14="http://schemas.microsoft.com/office/word/2010/wordprocessingDrawing" xmlns:wp="http://schemas.openxmlformats.org/drawingml/2006/wordprocessingDrawing" xmlns:w10="urn:schemas-microsoft-com:office:word" xmlns:w="http://schemas.openxmlformats.org/wordprocessingml/2006/main" xmlns:w14="http://schemas.microsoft.com/office/word/2010/wordml" xmlns:wpg="http://schemas.microsoft.com/office/word/2010/wordprocessingGroup" xmlns:wpi="http://schemas.microsoft.com/office/word/2010/wordprocessingInk" xmlns:wne="http://schemas.microsoft.com/office/word/2006/wordml" xmlns:wps="http://schemas.microsoft.com/office/word/2010/wordprocessingShape" mc:Ignorable="w14 wp14">
   <w:body>
+    <w:p>
+      <w:pPr>
+        <w:spacing w:after="240"/>
+        <w:jc w:val="center"/>
+      </w:pPr>
+      <w:r>
+        <w:drawing>
+          <wp:inline distT="0" distB="0" distL="0" distR="0">
+            <wp:extent cx="2103120" cy="1744128"/>
+            <wp:effectExtent l="0" t="0" r="0" b="0"/>
+            <wp:docPr id="1" name="NextTargetLogo" descr="Next Target Training Company Logo"/>
+            <wp:cNvGraphicFramePr>
+              <a:graphicFrameLocks xmlns:a="http://schemas.openxmlformats.org/drawingml/2006/main" noChangeAspect="1"/>
+            </wp:cNvGraphicFramePr>
+            <a:graphic xmlns:a="http://schemas.openxmlformats.org/drawingml/2006/main">
+              <a:graphicData uri="http://schemas.openxmlformats.org/drawingml/2006/picture">
+                <pic:pic xmlns:pic="http://schemas.openxmlformats.org/drawingml/2006/picture">
+                  <pic:nvPicPr>
+                    <pic:cNvPr id="1" name="NextTargetLogo"/>
+                    <pic:cNvPicPr/>
+                  </pic:nvPicPr>
+                  <pic:blipFill>
+                    <a:blip r:embed="rId9"/>
+                    <a:stretch>
+                      <a:fillRect/>
+                    </a:stretch>
+                  </pic:blipFill>
+                  <pic:spPr>
+                    <a:xfrm>
+                      <a:off x="0" y="0"/>
+                      <a:ext cx="2103120" cy="1744128"/>
+                    </a:xfrm>
+                    <a:prstGeom prst="rect">
+                      <a:avLst/>
+                    </a:prstGeom>
+                  </pic:spPr>
+                </pic:pic>
+              </a:graphicData>
+            </a:graphic>
+          </wp:inline>
+        </w:drawing>
+      </w:r>
+    </w:p>
     <w:p>
       <w:pPr>
         <w:jc w:val="center"/>
@@ -9,7 +52,7 @@
       <w:r>
         <w:rPr>
           <w:b/>
-          <w:color w:val="3264C8"/>
+          <w:color w:val="1A3A52"/>
           <w:sz w:val="64"/>
         </w:rPr>
         <w:t>الخطة التشغيلية</w:t>
@@ -23,7 +66,7 @@
       </w:pPr>
       <w:r>
         <w:rPr>
-          <w:color w:val="649600"/>
+          <w:color w:val="2ECC71"/>
           <w:sz w:val="36"/>
         </w:rPr>
         <w:t>Next Target Training Company</w:t>
@@ -198,7 +241,7 @@
       <w:tblPr>
         <w:tblStyle w:val="LightGrid-Accent1"/>
         <w:tblW w:type="auto" w:w="0"/>
-        <w:tblLook w:firstColumn="1" w:firstRow="1" w:lastColumn="0" w:lastRow="0" w:noHBand="0" w:noVBand="1" w:val="04A0"/>
+        <w:tblLook w:firstColumn="0" w:firstRow="1" w:lastColumn="0" w:lastRow="0" w:noHBand="0" w:noVBand="1" w:val="0480"/>
       </w:tblPr>
       <w:tblGrid>
         <w:gridCol w:w="4680"/>
@@ -208,11 +251,13 @@
         <w:tc>
           <w:tcPr>
             <w:tcW w:type="dxa" w:w="4680"/>
+            <w:shd w:val="clear" w:color="auto" w:fill="1A3A52"/>
           </w:tcPr>
           <w:p>
             <w:r>
               <w:rPr>
                 <w:b/>
+                <w:color w:val="FFFFFF"/>
               </w:rPr>
               <w:t>الموظف | Staff</w:t>
             </w:r>
@@ -221,11 +266,13 @@
         <w:tc>
           <w:tcPr>
             <w:tcW w:type="dxa" w:w="4680"/>
+            <w:shd w:val="clear" w:color="auto" w:fill="1A3A52"/>
           </w:tcPr>
           <w:p>
             <w:r>
               <w:rPr>
                 <w:b/>
+                <w:color w:val="FFFFFF"/>
               </w:rPr>
               <w:t>الراتب الشهري | Monthly Salary (SAR)</w:t>
             </w:r>
@@ -280,11 +327,13 @@
         <w:tc>
           <w:tcPr>
             <w:tcW w:type="dxa" w:w="4680"/>
+            <w:shd w:val="clear" w:color="auto" w:fill="ECF0F1"/>
           </w:tcPr>
           <w:p>
             <w:r>
               <w:rPr>
                 <w:b/>
+                <w:color w:val="1A3A52"/>
               </w:rPr>
               <w:t>إجمالي الرواتب | Total Salaries</w:t>
             </w:r>
@@ -293,11 +342,13 @@
         <w:tc>
           <w:tcPr>
             <w:tcW w:type="dxa" w:w="4680"/>
+            <w:shd w:val="clear" w:color="auto" w:fill="ECF0F1"/>
           </w:tcPr>
           <w:p>
             <w:r>
               <w:rPr>
                 <w:b/>
+                <w:color w:val="1A3A52"/>
               </w:rPr>
               <w:t>15,000 SAR</w:t>
             </w:r>
@@ -381,7 +432,7 @@
       <w:tblPr>
         <w:tblStyle w:val="LightGrid-Accent1"/>
         <w:tblW w:type="auto" w:w="0"/>
-        <w:tblLook w:firstColumn="1" w:firstRow="1" w:lastColumn="0" w:lastRow="0" w:noHBand="0" w:noVBand="1" w:val="04A0"/>
+        <w:tblLook w:firstColumn="0" w:firstRow="1" w:lastColumn="0" w:lastRow="0" w:noHBand="0" w:noVBand="1" w:val="0480"/>
       </w:tblPr>
       <w:tblGrid>
         <w:gridCol w:w="3120"/>
@@ -392,9 +443,14 @@
         <w:tc>
           <w:tcPr>
             <w:tcW w:type="dxa" w:w="3120"/>
+            <w:shd w:val="clear" w:color="auto" w:fill="1A3A52"/>
           </w:tcPr>
           <w:p>
             <w:r>
+              <w:rPr>
+                <w:b/>
+                <w:color w:val="FFFFFF"/>
+              </w:rPr>
               <w:t>البند | Item</w:t>
             </w:r>
           </w:p>
@@ -402,9 +458,14 @@
         <w:tc>
           <w:tcPr>
             <w:tcW w:type="dxa" w:w="3120"/>
+            <w:shd w:val="clear" w:color="auto" w:fill="1A3A52"/>
           </w:tcPr>
           <w:p>
             <w:r>
+              <w:rPr>
+                <w:b/>
+                <w:color w:val="FFFFFF"/>
+              </w:rPr>
               <w:t>المبلغ | Amount (SAR)</w:t>
             </w:r>
           </w:p>
@@ -412,9 +473,14 @@
         <w:tc>
           <w:tcPr>
             <w:tcW w:type="dxa" w:w="3120"/>
+            <w:shd w:val="clear" w:color="auto" w:fill="1A3A52"/>
           </w:tcPr>
           <w:p>
             <w:r>
+              <w:rPr>
+                <w:b/>
+                <w:color w:val="FFFFFF"/>
+              </w:rPr>
               <w:t>الملاحظات | Notes</w:t>
             </w:r>
           </w:p>
@@ -584,12 +650,14 @@
         <w:tc>
           <w:tcPr>
             <w:tcW w:type="dxa" w:w="3120"/>
+            <w:shd w:val="clear" w:color="auto" w:fill="ECF0F1"/>
           </w:tcPr>
           <w:p>
             <w:r>
               <w:rPr>
                 <w:b/>
                 <w:sz w:val="24"/>
+                <w:color w:val="1A3A52"/>
               </w:rPr>
               <w:t>الإجمالي | TOTAL</w:t>
             </w:r>
@@ -598,12 +666,14 @@
         <w:tc>
           <w:tcPr>
             <w:tcW w:type="dxa" w:w="3120"/>
+            <w:shd w:val="clear" w:color="auto" w:fill="ECF0F1"/>
           </w:tcPr>
           <w:p>
             <w:r>
               <w:rPr>
                 <w:b/>
                 <w:sz w:val="24"/>
+                <w:color w:val="1A3A52"/>
               </w:rPr>
               <w:t>100,000</w:t>
             </w:r>
@@ -612,12 +682,14 @@
         <w:tc>
           <w:tcPr>
             <w:tcW w:type="dxa" w:w="3120"/>
+            <w:shd w:val="clear" w:color="auto" w:fill="ECF0F1"/>
           </w:tcPr>
           <w:p>
             <w:r>
               <w:rPr>
                 <w:b/>
                 <w:sz w:val="24"/>
+                <w:color w:val="1A3A52"/>
               </w:rPr>
               <w:t>الحد الأقصى للربع الأول | Q1 Maximum</w:t>
             </w:r>
@@ -790,7 +862,7 @@
       <w:tblPr>
         <w:tblStyle w:val="LightGrid-Accent1"/>
         <w:tblW w:type="auto" w:w="0"/>
-        <w:tblLook w:firstColumn="1" w:firstRow="1" w:lastColumn="0" w:lastRow="0" w:noHBand="0" w:noVBand="1" w:val="04A0"/>
+        <w:tblLook w:firstColumn="0" w:firstRow="1" w:lastColumn="0" w:lastRow="0" w:noHBand="0" w:noVBand="1" w:val="0480"/>
       </w:tblPr>
       <w:tblGrid>
         <w:gridCol w:w="3120"/>
@@ -801,9 +873,14 @@
         <w:tc>
           <w:tcPr>
             <w:tcW w:type="dxa" w:w="3120"/>
+            <w:shd w:val="clear" w:color="auto" w:fill="1A3A52"/>
           </w:tcPr>
           <w:p>
             <w:r>
+              <w:rPr>
+                <w:b/>
+                <w:color w:val="FFFFFF"/>
+              </w:rPr>
               <w:t>المؤشر | KPI</w:t>
             </w:r>
           </w:p>
@@ -811,9 +888,14 @@
         <w:tc>
           <w:tcPr>
             <w:tcW w:type="dxa" w:w="3120"/>
+            <w:shd w:val="clear" w:color="auto" w:fill="1A3A52"/>
           </w:tcPr>
           <w:p>
             <w:r>
+              <w:rPr>
+                <w:b/>
+                <w:color w:val="FFFFFF"/>
+              </w:rPr>
               <w:t>الهدف | Target</w:t>
             </w:r>
           </w:p>
@@ -821,9 +903,14 @@
         <w:tc>
           <w:tcPr>
             <w:tcW w:type="dxa" w:w="3120"/>
+            <w:shd w:val="clear" w:color="auto" w:fill="1A3A52"/>
           </w:tcPr>
           <w:p>
             <w:r>
+              <w:rPr>
+                <w:b/>
+                <w:color w:val="FFFFFF"/>
+              </w:rPr>
               <w:t>التكرار | Frequency</w:t>
             </w:r>
           </w:p>
@@ -1443,7 +1530,7 @@
       <w:rFonts w:asciiTheme="majorHAnsi" w:eastAsiaTheme="majorEastAsia" w:hAnsiTheme="majorHAnsi" w:cstheme="majorBidi"/>
       <w:b/>
       <w:bCs/>
-      <w:color w:val="365F91" w:themeColor="accent1" w:themeShade="BF"/>
+      <w:color w:val="1A3A52"/>
       <w:sz w:val="28"/>
       <w:szCs w:val="28"/>
     </w:rPr>
@@ -1467,7 +1554,7 @@
       <w:rFonts w:asciiTheme="majorHAnsi" w:eastAsiaTheme="majorEastAsia" w:hAnsiTheme="majorHAnsi" w:cstheme="majorBidi"/>
       <w:b/>
       <w:bCs/>
-      <w:color w:val="4F81BD" w:themeColor="accent1"/>
+      <w:color w:val="3498DB"/>
       <w:sz w:val="26"/>
       <w:szCs w:val="26"/>
     </w:rPr>
@@ -3850,12 +3937,12 @@
       <w:tblStyleColBandSize w:val="1"/>
       <w:tblInd w:w="0" w:type="dxa"/>
       <w:tblBorders>
-        <w:top w:val="single" w:sz="8" w:space="0" w:color="4F81BD" w:themeColor="accent1"/>
-        <w:left w:val="single" w:sz="8" w:space="0" w:color="4F81BD" w:themeColor="accent1"/>
-        <w:bottom w:val="single" w:sz="8" w:space="0" w:color="4F81BD" w:themeColor="accent1"/>
-        <w:right w:val="single" w:sz="8" w:space="0" w:color="4F81BD" w:themeColor="accent1"/>
-        <w:insideH w:val="single" w:sz="8" w:space="0" w:color="4F81BD" w:themeColor="accent1"/>
-        <w:insideV w:val="single" w:sz="8" w:space="0" w:color="4F81BD" w:themeColor="accent1"/>
+        <w:top w:val="single" w:sz="8" w:space="0" w:color="1A3A52"/>
+        <w:left w:val="single" w:sz="8" w:space="0" w:color="1A3A52"/>
+        <w:bottom w:val="single" w:sz="8" w:space="0" w:color="1A3A52"/>
+        <w:right w:val="single" w:sz="8" w:space="0" w:color="1A3A52"/>
+        <w:insideH w:val="single" w:sz="8" w:space="0" w:color="1A3A52"/>
+        <w:insideV w:val="single" w:sz="8" w:space="0" w:color="1A3A52"/>
       </w:tblBorders>
       <w:tblCellMar>
         <w:top w:w="0" w:type="dxa"/>
@@ -3872,17 +3959,19 @@
         <w:rFonts w:asciiTheme="majorHAnsi" w:eastAsiaTheme="majorEastAsia" w:hAnsiTheme="majorHAnsi" w:cstheme="majorBidi"/>
         <w:b/>
         <w:bCs/>
-      </w:rPr>
-      <w:tblPr/>
-      <w:tcPr>
-        <w:tcBorders>
-          <w:top w:val="single" w:sz="8" w:space="0" w:color="4F81BD" w:themeColor="accent1"/>
-          <w:left w:val="single" w:sz="8" w:space="0" w:color="4F81BD" w:themeColor="accent1"/>
-          <w:bottom w:val="single" w:sz="18" w:space="0" w:color="4F81BD" w:themeColor="accent1"/>
-          <w:right w:val="single" w:sz="8" w:space="0" w:color="4F81BD" w:themeColor="accent1"/>
-          <w:insideH w:val="nil"/>
-          <w:insideV w:val="single" w:sz="8" w:space="0" w:color="4F81BD" w:themeColor="accent1"/>
-        </w:tcBorders>
+        <w:color w:val="FFFFFF"/>
+      </w:rPr>
+      <w:tblPr/>
+      <w:tcPr>
+        <w:tcBorders>
+          <w:top w:val="single" w:sz="8" w:space="0" w:color="1A3A52"/>
+          <w:left w:val="single" w:sz="8" w:space="0" w:color="1A3A52"/>
+          <w:bottom w:val="single" w:sz="18" w:space="0" w:color="1A3A52"/>
+          <w:right w:val="single" w:sz="8" w:space="0" w:color="1A3A52"/>
+          <w:insideH w:val="nil"/>
+          <w:insideV w:val="single" w:sz="8" w:space="0" w:color="1A3A52"/>
+        </w:tcBorders>
+        <w:shd w:val="clear" w:color="auto" w:fill="1A3A52"/>
       </w:tcPr>
     </w:tblStylePr>
     <w:tblStylePr w:type="lastRow">
@@ -3893,17 +3982,19 @@
         <w:rFonts w:asciiTheme="majorHAnsi" w:eastAsiaTheme="majorEastAsia" w:hAnsiTheme="majorHAnsi" w:cstheme="majorBidi"/>
         <w:b/>
         <w:bCs/>
-      </w:rPr>
-      <w:tblPr/>
-      <w:tcPr>
-        <w:tcBorders>
-          <w:top w:val="double" w:sz="6" w:space="0" w:color="4F81BD" w:themeColor="accent1"/>
-          <w:left w:val="single" w:sz="8" w:space="0" w:color="4F81BD" w:themeColor="accent1"/>
-          <w:bottom w:val="single" w:sz="8" w:space="0" w:color="4F81BD" w:themeColor="accent1"/>
-          <w:right w:val="single" w:sz="8" w:space="0" w:color="4F81BD" w:themeColor="accent1"/>
-          <w:insideH w:val="nil"/>
-          <w:insideV w:val="single" w:sz="8" w:space="0" w:color="4F81BD" w:themeColor="accent1"/>
-        </w:tcBorders>
+        <w:color w:val="1A3A52"/>
+      </w:rPr>
+      <w:tblPr/>
+      <w:tcPr>
+        <w:tcBorders>
+          <w:top w:val="double" w:sz="6" w:space="0" w:color="1A3A52"/>
+          <w:left w:val="single" w:sz="8" w:space="0" w:color="1A3A52"/>
+          <w:bottom w:val="single" w:sz="8" w:space="0" w:color="1A3A52"/>
+          <w:right w:val="single" w:sz="8" w:space="0" w:color="1A3A52"/>
+          <w:insideH w:val="nil"/>
+          <w:insideV w:val="single" w:sz="8" w:space="0" w:color="1A3A52"/>
+        </w:tcBorders>
+        <w:shd w:val="clear" w:color="auto" w:fill="ECF0F1"/>
       </w:tcPr>
     </w:tblStylePr>
     <w:tblStylePr w:type="firstCol">
@@ -3922,10 +4013,10 @@
       <w:tblPr/>
       <w:tcPr>
         <w:tcBorders>
-          <w:top w:val="single" w:sz="8" w:space="0" w:color="4F81BD" w:themeColor="accent1"/>
-          <w:left w:val="single" w:sz="8" w:space="0" w:color="4F81BD" w:themeColor="accent1"/>
-          <w:bottom w:val="single" w:sz="8" w:space="0" w:color="4F81BD" w:themeColor="accent1"/>
-          <w:right w:val="single" w:sz="8" w:space="0" w:color="4F81BD" w:themeColor="accent1"/>
+          <w:top w:val="single" w:sz="8" w:space="0" w:color="1A3A52"/>
+          <w:left w:val="single" w:sz="8" w:space="0" w:color="1A3A52"/>
+          <w:bottom w:val="single" w:sz="8" w:space="0" w:color="1A3A52"/>
+          <w:right w:val="single" w:sz="8" w:space="0" w:color="1A3A52"/>
         </w:tcBorders>
       </w:tcPr>
     </w:tblStylePr>
@@ -3933,36 +4024,36 @@
       <w:tblPr/>
       <w:tcPr>
         <w:tcBorders>
-          <w:top w:val="single" w:sz="8" w:space="0" w:color="4F81BD" w:themeColor="accent1"/>
-          <w:left w:val="single" w:sz="8" w:space="0" w:color="4F81BD" w:themeColor="accent1"/>
-          <w:bottom w:val="single" w:sz="8" w:space="0" w:color="4F81BD" w:themeColor="accent1"/>
-          <w:right w:val="single" w:sz="8" w:space="0" w:color="4F81BD" w:themeColor="accent1"/>
-        </w:tcBorders>
-        <w:shd w:val="clear" w:color="auto" w:fill="D3DFEE" w:themeFill="accent1" w:themeFillTint="3F"/>
+          <w:top w:val="single" w:sz="8" w:space="0" w:color="1A3A52"/>
+          <w:left w:val="single" w:sz="8" w:space="0" w:color="1A3A52"/>
+          <w:bottom w:val="single" w:sz="8" w:space="0" w:color="1A3A52"/>
+          <w:right w:val="single" w:sz="8" w:space="0" w:color="1A3A52"/>
+        </w:tcBorders>
+        <w:shd w:val="clear" w:color="auto" w:fill="EAF0F5"/>
       </w:tcPr>
     </w:tblStylePr>
     <w:tblStylePr w:type="band1Horz">
       <w:tblPr/>
       <w:tcPr>
         <w:tcBorders>
-          <w:top w:val="single" w:sz="8" w:space="0" w:color="4F81BD" w:themeColor="accent1"/>
-          <w:left w:val="single" w:sz="8" w:space="0" w:color="4F81BD" w:themeColor="accent1"/>
-          <w:bottom w:val="single" w:sz="8" w:space="0" w:color="4F81BD" w:themeColor="accent1"/>
-          <w:right w:val="single" w:sz="8" w:space="0" w:color="4F81BD" w:themeColor="accent1"/>
-          <w:insideV w:val="single" w:sz="8" w:space="0" w:color="4F81BD" w:themeColor="accent1"/>
-        </w:tcBorders>
-        <w:shd w:val="clear" w:color="auto" w:fill="D3DFEE" w:themeFill="accent1" w:themeFillTint="3F"/>
+          <w:top w:val="single" w:sz="8" w:space="0" w:color="1A3A52"/>
+          <w:left w:val="single" w:sz="8" w:space="0" w:color="1A3A52"/>
+          <w:bottom w:val="single" w:sz="8" w:space="0" w:color="1A3A52"/>
+          <w:right w:val="single" w:sz="8" w:space="0" w:color="1A3A52"/>
+          <w:insideV w:val="single" w:sz="8" w:space="0" w:color="1A3A52"/>
+        </w:tcBorders>
+        <w:shd w:val="clear" w:color="auto" w:fill="EAF0F5"/>
       </w:tcPr>
     </w:tblStylePr>
     <w:tblStylePr w:type="band2Horz">
       <w:tblPr/>
       <w:tcPr>
         <w:tcBorders>
-          <w:top w:val="single" w:sz="8" w:space="0" w:color="4F81BD" w:themeColor="accent1"/>
-          <w:left w:val="single" w:sz="8" w:space="0" w:color="4F81BD" w:themeColor="accent1"/>
-          <w:bottom w:val="single" w:sz="8" w:space="0" w:color="4F81BD" w:themeColor="accent1"/>
-          <w:right w:val="single" w:sz="8" w:space="0" w:color="4F81BD" w:themeColor="accent1"/>
-          <w:insideV w:val="single" w:sz="8" w:space="0" w:color="4F81BD" w:themeColor="accent1"/>
+          <w:top w:val="single" w:sz="8" w:space="0" w:color="1A3A52"/>
+          <w:left w:val="single" w:sz="8" w:space="0" w:color="1A3A52"/>
+          <w:bottom w:val="single" w:sz="8" w:space="0" w:color="1A3A52"/>
+          <w:right w:val="single" w:sz="8" w:space="0" w:color="1A3A52"/>
+          <w:insideV w:val="single" w:sz="8" w:space="0" w:color="1A3A52"/>
         </w:tcBorders>
       </w:tcPr>
     </w:tblStylePr>

</xml_diff>